<commit_message>
A ton of notes I wrote
</commit_message>
<xml_diff>
--- a/Assets/Documentation and notes/Figuring out octrees.docx
+++ b/Assets/Documentation and notes/Figuring out octrees.docx
@@ -83,6 +83,66 @@
     <w:p>
       <w:r>
         <w:t>User runs a ‘set’ function for a grid space.</w:t>
+      </w:r>
+    </w:p>
+    <w:p/>
+    <w:p/>
+    <w:p>
+      <w:r>
+        <w:t>21-23/05/2026</w:t>
+      </w:r>
+    </w:p>
+    <w:p>
+      <w:r>
+        <w:t xml:space="preserve">I think I need to set it </w:t>
+      </w:r>
+      <w:proofErr w:type="gramStart"/>
+      <w:r>
+        <w:t>up</w:t>
+      </w:r>
+      <w:proofErr w:type="gramEnd"/>
+      <w:r>
+        <w:t xml:space="preserve"> so an octree is assigned to every slot? And if it doesn’t have any children, it’s a leaf?</w:t>
+      </w:r>
+    </w:p>
+    <w:p>
+      <w:r>
+        <w:t>But what about leaves that exist despite being occupied, because it’s too small to subdivide further?</w:t>
+      </w:r>
+    </w:p>
+    <w:p>
+      <w:r>
+        <w:lastRenderedPageBreak/>
+        <w:t>I guess I do the check first, and either assign a child octant or a leaf based on if there’s nothing there? And only use child octants to find more leaves? And if a space isn’t a leaf but also can’t be subdivided further, I just do nothing?</w:t>
+      </w:r>
+    </w:p>
+    <w:p>
+      <w:r>
+        <w:t>But what if I need to use the octree specifically to search for the spaces that meet the criteria?</w:t>
+      </w:r>
+    </w:p>
+    <w:p>
+      <w:r>
+        <w:t>Maybe I’m looking at the checks the wrong way. Maybe instead of ‘meets criteria’ vs ‘doesn’t’, it’s ‘needs to be checked further’ vs. ‘is all fine’?</w:t>
+      </w:r>
+    </w:p>
+    <w:p>
+      <w:r>
+        <w:t xml:space="preserve">I feel like even though I’ve been able to reproduce the general principle of an octree, I haven’t learned enough to </w:t>
+      </w:r>
+      <w:proofErr w:type="gramStart"/>
+      <w:r>
+        <w:t>actually figure</w:t>
+      </w:r>
+      <w:proofErr w:type="gramEnd"/>
+      <w:r>
+        <w:t xml:space="preserve"> out how to use it.</w:t>
+      </w:r>
+    </w:p>
+    <w:p/>
+    <w:p>
+      <w:r>
+        <w:t>I think that instead of only creating a child octant if something is detected, create it first and have the detection for the octant itself only occur at the start of its own search function? If it detects there may be children, create child octants and have them figure things out. If not, keep going.</w:t>
       </w:r>
     </w:p>
     <w:p/>

</xml_diff>